<commit_message>
chore(kb): use embedding venv for local dev
</commit_message>
<xml_diff>
--- a/test-knowledge-docs/抱枕回复策略.docx
+++ b/test-knowledge-docs/抱枕回复策略.docx
@@ -63,6 +63,11 @@
     <w:p>
       <w:pPr>
         <w:keepLines/>
+        <w:rPr>
+          <w:rFonts w:hint="eastAsia"/>
+          <w:sz w:val="22"/>
+          <w:lang w:eastAsia="zh-CN"/>
+        </w:rPr>
       </w:pPr>
       <w:r>
         <w:rPr>
@@ -70,6 +75,32 @@
           <w:sz w:val="22"/>
         </w:rPr>
         <w:t>亲亲定制很简单哦～您把想要印制的图片发给客服，再选择好抱枕尺寸，我们确认图片没问题就可以安排制作啦。动漫图片、个人照片、手绘图片、企业 logo 都可以定制</w:t>
+      </w:r>
+      <w:r>
+        <w:rPr>
+          <w:rFonts w:hint="eastAsia"/>
+          <w:sz w:val="22"/>
+          <w:lang w:eastAsia="zh-CN"/>
+        </w:rPr>
+        <w:t>。</w:t>
+      </w:r>
+    </w:p>
+    <w:p>
+      <w:pPr>
+        <w:keepLines/>
+        <w:rPr>
+          <w:rFonts w:hint="default"/>
+          <w:sz w:val="22"/>
+          <w:lang w:val="en-US" w:eastAsia="zh-CN"/>
+        </w:rPr>
+      </w:pPr>
+      <w:r>
+        <w:rPr>
+          <w:rFonts w:hint="eastAsia"/>
+          <w:sz w:val="22"/>
+          <w:lang w:val="en-US" w:eastAsia="zh-CN"/>
+        </w:rPr>
+        <w:t>如果不需要定制，则直接按下单时选择的商品原图正常安排制作，不需要另外提供图片啦。</w:t>
       </w:r>
     </w:p>
     <w:p>
@@ -83,6 +114,10 @@
     <w:p>
       <w:pPr>
         <w:keepLines/>
+        <w:rPr>
+          <w:rFonts w:ascii="Calibri" w:hAnsi="Calibri" w:eastAsia="微软雅黑"/>
+          <w:sz w:val="22"/>
+        </w:rPr>
       </w:pPr>
       <w:r>
         <w:rPr>
@@ -90,6 +125,23 @@
           <w:sz w:val="22"/>
         </w:rPr>
         <w:t>亲亲建议您发送高清原图哦！图片清晰度越高，打印出来抱枕效果越好，如果图片分辨率过低，印花会出现模糊，我们会提前跟您沟通确认。</w:t>
+      </w:r>
+    </w:p>
+    <w:p>
+      <w:pPr>
+        <w:keepLines/>
+        <w:rPr>
+          <w:rFonts w:ascii="Calibri" w:hAnsi="Calibri" w:eastAsia="微软雅黑"/>
+          <w:sz w:val="22"/>
+        </w:rPr>
+      </w:pPr>
+      <w:r>
+        <w:rPr>
+          <w:rFonts w:hint="eastAsia"/>
+          <w:sz w:val="22"/>
+          <w:lang w:val="en-US" w:eastAsia="zh-CN"/>
+        </w:rPr>
+        <w:t>如果不需要定制，则直接按下单时选择的商品原图正常安排制作，不需要另外提供图片啦。</w:t>
       </w:r>
     </w:p>
     <w:p>
@@ -109,8 +161,25 @@
           <w:rFonts w:ascii="Calibri" w:hAnsi="Calibri" w:eastAsia="微软雅黑"/>
           <w:sz w:val="22"/>
         </w:rPr>
-        <w:t>亲亲，默认是正反面相同图案哦，如果您需要双面不同图案，可以联系客服补差价，拍下后把正反面两张图都发给我们哈。</w:t>
+        <w:t>亲亲，默认是正反面相同图案哦，如果您需要双面不同图案，可以联系客服</w:t>
       </w:r>
+      <w:r>
+        <w:rPr>
+          <w:rFonts w:hint="eastAsia"/>
+          <w:sz w:val="22"/>
+          <w:lang w:val="en-US" w:eastAsia="zh-CN"/>
+        </w:rPr>
+        <w:t>说明就好</w:t>
+      </w:r>
+      <w:r>
+        <w:rPr>
+          <w:rFonts w:ascii="Calibri" w:hAnsi="Calibri" w:eastAsia="微软雅黑"/>
+          <w:sz w:val="22"/>
+        </w:rPr>
+        <w:t>，拍下后把正反面两张图都发给我们哈。</w:t>
+      </w:r>
+      <w:bookmarkStart w:id="0" w:name="_GoBack"/>
+      <w:bookmarkEnd w:id="0"/>
     </w:p>
     <w:p>
       <w:pPr>
@@ -289,11 +358,6 @@
     <w:p>
       <w:pPr>
         <w:keepLines/>
-        <w:rPr>
-          <w:rFonts w:hint="default" w:ascii="Calibri" w:hAnsi="Calibri" w:eastAsia="微软雅黑"/>
-          <w:sz w:val="22"/>
-          <w:lang w:val="en-US" w:eastAsia="zh-CN"/>
-        </w:rPr>
       </w:pPr>
       <w:r>
         <w:rPr>
@@ -301,20 +365,7 @@
           <w:sz w:val="22"/>
           <w:lang w:val="en-US" w:eastAsia="zh-CN"/>
         </w:rPr>
-        <w:t>正常下单后3天内发货。</w:t>
-      </w:r>
-    </w:p>
-    <w:p>
-      <w:pPr>
-        <w:keepLines/>
-      </w:pPr>
-      <w:r>
-        <w:rPr>
-          <w:rFonts w:hint="eastAsia"/>
-          <w:sz w:val="22"/>
-          <w:lang w:val="en-US" w:eastAsia="zh-CN"/>
-        </w:rPr>
-        <w:t>如果是</w:t>
+        <w:t>正常下单后3天内发货，直接用商品原图制作，如果需要定制，则是</w:t>
       </w:r>
       <w:r>
         <w:rPr>
@@ -368,8 +419,6 @@
         </w:rPr>
         <w:t>发货，定制商品不支持极速退款，拍下后无法随意更改图案哦。</w:t>
       </w:r>
-      <w:bookmarkStart w:id="0" w:name="_GoBack"/>
-      <w:bookmarkEnd w:id="0"/>
     </w:p>
     <w:p>
       <w:pPr>
@@ -677,7 +726,7 @@
     <w:lsdException w:uiPriority="99" w:name="List 4"/>
     <w:lsdException w:uiPriority="99" w:name="List 5"/>
     <w:lsdException w:qFormat="1" w:uiPriority="99" w:semiHidden="0" w:name="List Bullet 2"/>
-    <w:lsdException w:uiPriority="99" w:semiHidden="0" w:name="List Bullet 3"/>
+    <w:lsdException w:qFormat="1" w:uiPriority="99" w:semiHidden="0" w:name="List Bullet 3"/>
     <w:lsdException w:uiPriority="99" w:name="List Bullet 4"/>
     <w:lsdException w:uiPriority="99" w:name="List Bullet 5"/>
     <w:lsdException w:qFormat="1" w:uiPriority="99" w:semiHidden="0" w:name="List Number 2"/>
@@ -687,11 +736,11 @@
     <w:lsdException w:qFormat="1" w:unhideWhenUsed="0" w:uiPriority="10" w:semiHidden="0" w:name="Title"/>
     <w:lsdException w:uiPriority="99" w:name="Closing"/>
     <w:lsdException w:uiPriority="99" w:name="Signature"/>
-    <w:lsdException w:uiPriority="1" w:name="Default Paragraph Font"/>
+    <w:lsdException w:qFormat="1" w:uiPriority="1" w:name="Default Paragraph Font"/>
     <w:lsdException w:qFormat="1" w:uiPriority="99" w:semiHidden="0" w:name="Body Text"/>
     <w:lsdException w:uiPriority="99" w:name="Body Text Indent"/>
     <w:lsdException w:qFormat="1" w:uiPriority="99" w:semiHidden="0" w:name="List Continue"/>
-    <w:lsdException w:uiPriority="99" w:semiHidden="0" w:name="List Continue 2"/>
+    <w:lsdException w:qFormat="1" w:uiPriority="99" w:semiHidden="0" w:name="List Continue 2"/>
     <w:lsdException w:qFormat="1" w:uiPriority="99" w:semiHidden="0" w:name="List Continue 3"/>
     <w:lsdException w:uiPriority="99" w:name="List Continue 4"/>
     <w:lsdException w:uiPriority="99" w:name="List Continue 5"/>
@@ -725,7 +774,7 @@
     <w:lsdException w:uiPriority="99" w:name="HTML Sample"/>
     <w:lsdException w:uiPriority="99" w:name="HTML Typewriter"/>
     <w:lsdException w:uiPriority="99" w:name="HTML Variable"/>
-    <w:lsdException w:uiPriority="99" w:name="Normal Table"/>
+    <w:lsdException w:qFormat="1" w:uiPriority="99" w:name="Normal Table"/>
     <w:lsdException w:uiPriority="99" w:name="annotation subject"/>
     <w:lsdException w:uiPriority="99" w:name="Table Simple 1"/>
     <w:lsdException w:uiPriority="99" w:name="Table Simple 2"/>
@@ -770,23 +819,23 @@
     <w:lsdException w:uiPriority="99" w:name="Table Web 2"/>
     <w:lsdException w:uiPriority="99" w:name="Table Web 3"/>
     <w:lsdException w:uiPriority="99" w:name="Balloon Text"/>
-    <w:lsdException w:unhideWhenUsed="0" w:uiPriority="59" w:semiHidden="0" w:name="Table Grid"/>
+    <w:lsdException w:qFormat="1" w:unhideWhenUsed="0" w:uiPriority="59" w:semiHidden="0" w:name="Table Grid"/>
     <w:lsdException w:uiPriority="99" w:name="Table Theme"/>
     <w:lsdException w:qFormat="1" w:unhideWhenUsed="0" w:uiPriority="1" w:semiHidden="0" w:name="No Spacing"/>
     <w:lsdException w:qFormat="1" w:unhideWhenUsed="0" w:uiPriority="60" w:semiHidden="0" w:name="Light Shading"/>
     <w:lsdException w:qFormat="1" w:unhideWhenUsed="0" w:uiPriority="61" w:semiHidden="0" w:name="Light List"/>
     <w:lsdException w:qFormat="1" w:unhideWhenUsed="0" w:uiPriority="62" w:semiHidden="0" w:name="Light Grid"/>
     <w:lsdException w:qFormat="1" w:unhideWhenUsed="0" w:uiPriority="63" w:semiHidden="0" w:name="Medium Shading 1"/>
-    <w:lsdException w:unhideWhenUsed="0" w:uiPriority="64" w:semiHidden="0" w:name="Medium Shading 2"/>
-    <w:lsdException w:unhideWhenUsed="0" w:uiPriority="65" w:semiHidden="0" w:name="Medium List 1"/>
-    <w:lsdException w:unhideWhenUsed="0" w:uiPriority="66" w:semiHidden="0" w:name="Medium List 2"/>
-    <w:lsdException w:unhideWhenUsed="0" w:uiPriority="67" w:semiHidden="0" w:name="Medium Grid 1"/>
-    <w:lsdException w:unhideWhenUsed="0" w:uiPriority="68" w:semiHidden="0" w:name="Medium Grid 2"/>
-    <w:lsdException w:unhideWhenUsed="0" w:uiPriority="69" w:semiHidden="0" w:name="Medium Grid 3"/>
-    <w:lsdException w:unhideWhenUsed="0" w:uiPriority="70" w:semiHidden="0" w:name="Dark List"/>
-    <w:lsdException w:unhideWhenUsed="0" w:uiPriority="71" w:semiHidden="0" w:name="Colorful Shading"/>
-    <w:lsdException w:unhideWhenUsed="0" w:uiPriority="72" w:semiHidden="0" w:name="Colorful List"/>
-    <w:lsdException w:unhideWhenUsed="0" w:uiPriority="73" w:semiHidden="0" w:name="Colorful Grid"/>
+    <w:lsdException w:qFormat="1" w:unhideWhenUsed="0" w:uiPriority="64" w:semiHidden="0" w:name="Medium Shading 2"/>
+    <w:lsdException w:qFormat="1" w:unhideWhenUsed="0" w:uiPriority="65" w:semiHidden="0" w:name="Medium List 1"/>
+    <w:lsdException w:qFormat="1" w:unhideWhenUsed="0" w:uiPriority="66" w:semiHidden="0" w:name="Medium List 2"/>
+    <w:lsdException w:qFormat="1" w:unhideWhenUsed="0" w:uiPriority="67" w:semiHidden="0" w:name="Medium Grid 1"/>
+    <w:lsdException w:qFormat="1" w:unhideWhenUsed="0" w:uiPriority="68" w:semiHidden="0" w:name="Medium Grid 2"/>
+    <w:lsdException w:qFormat="1" w:unhideWhenUsed="0" w:uiPriority="69" w:semiHidden="0" w:name="Medium Grid 3"/>
+    <w:lsdException w:qFormat="1" w:unhideWhenUsed="0" w:uiPriority="70" w:semiHidden="0" w:name="Dark List"/>
+    <w:lsdException w:qFormat="1" w:unhideWhenUsed="0" w:uiPriority="71" w:semiHidden="0" w:name="Colorful Shading"/>
+    <w:lsdException w:qFormat="1" w:unhideWhenUsed="0" w:uiPriority="72" w:semiHidden="0" w:name="Colorful List"/>
+    <w:lsdException w:qFormat="1" w:unhideWhenUsed="0" w:uiPriority="73" w:semiHidden="0" w:name="Colorful Grid"/>
     <w:lsdException w:qFormat="1" w:unhideWhenUsed="0" w:uiPriority="60" w:semiHidden="0" w:name="Light Shading Accent 1"/>
     <w:lsdException w:qFormat="1" w:unhideWhenUsed="0" w:uiPriority="61" w:semiHidden="0" w:name="Light List Accent 1"/>
     <w:lsdException w:qFormat="1" w:unhideWhenUsed="0" w:uiPriority="62" w:semiHidden="0" w:name="Light Grid Accent 1"/>
@@ -796,84 +845,84 @@
     <w:lsdException w:qFormat="1" w:unhideWhenUsed="0" w:uiPriority="34" w:semiHidden="0" w:name="List Paragraph"/>
     <w:lsdException w:qFormat="1" w:unhideWhenUsed="0" w:uiPriority="29" w:semiHidden="0" w:name="Quote"/>
     <w:lsdException w:qFormat="1" w:unhideWhenUsed="0" w:uiPriority="30" w:semiHidden="0" w:name="Intense Quote"/>
-    <w:lsdException w:unhideWhenUsed="0" w:uiPriority="66" w:semiHidden="0" w:name="Medium List 2 Accent 1"/>
-    <w:lsdException w:unhideWhenUsed="0" w:uiPriority="67" w:semiHidden="0" w:name="Medium Grid 1 Accent 1"/>
-    <w:lsdException w:unhideWhenUsed="0" w:uiPriority="68" w:semiHidden="0" w:name="Medium Grid 2 Accent 1"/>
-    <w:lsdException w:unhideWhenUsed="0" w:uiPriority="69" w:semiHidden="0" w:name="Medium Grid 3 Accent 1"/>
-    <w:lsdException w:unhideWhenUsed="0" w:uiPriority="70" w:semiHidden="0" w:name="Dark List Accent 1"/>
-    <w:lsdException w:unhideWhenUsed="0" w:uiPriority="71" w:semiHidden="0" w:name="Colorful Shading Accent 1"/>
-    <w:lsdException w:unhideWhenUsed="0" w:uiPriority="72" w:semiHidden="0" w:name="Colorful List Accent 1"/>
-    <w:lsdException w:unhideWhenUsed="0" w:uiPriority="73" w:semiHidden="0" w:name="Colorful Grid Accent 1"/>
+    <w:lsdException w:qFormat="1" w:unhideWhenUsed="0" w:uiPriority="66" w:semiHidden="0" w:name="Medium List 2 Accent 1"/>
+    <w:lsdException w:qFormat="1" w:unhideWhenUsed="0" w:uiPriority="67" w:semiHidden="0" w:name="Medium Grid 1 Accent 1"/>
+    <w:lsdException w:qFormat="1" w:unhideWhenUsed="0" w:uiPriority="68" w:semiHidden="0" w:name="Medium Grid 2 Accent 1"/>
+    <w:lsdException w:qFormat="1" w:unhideWhenUsed="0" w:uiPriority="69" w:semiHidden="0" w:name="Medium Grid 3 Accent 1"/>
+    <w:lsdException w:qFormat="1" w:unhideWhenUsed="0" w:uiPriority="70" w:semiHidden="0" w:name="Dark List Accent 1"/>
+    <w:lsdException w:qFormat="1" w:unhideWhenUsed="0" w:uiPriority="71" w:semiHidden="0" w:name="Colorful Shading Accent 1"/>
+    <w:lsdException w:qFormat="1" w:unhideWhenUsed="0" w:uiPriority="72" w:semiHidden="0" w:name="Colorful List Accent 1"/>
+    <w:lsdException w:qFormat="1" w:unhideWhenUsed="0" w:uiPriority="73" w:semiHidden="0" w:name="Colorful Grid Accent 1"/>
     <w:lsdException w:qFormat="1" w:unhideWhenUsed="0" w:uiPriority="60" w:semiHidden="0" w:name="Light Shading Accent 2"/>
     <w:lsdException w:qFormat="1" w:unhideWhenUsed="0" w:uiPriority="61" w:semiHidden="0" w:name="Light List Accent 2"/>
     <w:lsdException w:qFormat="1" w:unhideWhenUsed="0" w:uiPriority="62" w:semiHidden="0" w:name="Light Grid Accent 2"/>
     <w:lsdException w:qFormat="1" w:unhideWhenUsed="0" w:uiPriority="63" w:semiHidden="0" w:name="Medium Shading 1 Accent 2"/>
     <w:lsdException w:qFormat="1" w:unhideWhenUsed="0" w:uiPriority="64" w:semiHidden="0" w:name="Medium Shading 2 Accent 2"/>
     <w:lsdException w:qFormat="1" w:unhideWhenUsed="0" w:uiPriority="65" w:semiHidden="0" w:name="Medium List 1 Accent 2"/>
-    <w:lsdException w:unhideWhenUsed="0" w:uiPriority="66" w:semiHidden="0" w:name="Medium List 2 Accent 2"/>
-    <w:lsdException w:unhideWhenUsed="0" w:uiPriority="67" w:semiHidden="0" w:name="Medium Grid 1 Accent 2"/>
-    <w:lsdException w:unhideWhenUsed="0" w:uiPriority="68" w:semiHidden="0" w:name="Medium Grid 2 Accent 2"/>
-    <w:lsdException w:unhideWhenUsed="0" w:uiPriority="69" w:semiHidden="0" w:name="Medium Grid 3 Accent 2"/>
-    <w:lsdException w:unhideWhenUsed="0" w:uiPriority="70" w:semiHidden="0" w:name="Dark List Accent 2"/>
-    <w:lsdException w:unhideWhenUsed="0" w:uiPriority="71" w:semiHidden="0" w:name="Colorful Shading Accent 2"/>
-    <w:lsdException w:unhideWhenUsed="0" w:uiPriority="72" w:semiHidden="0" w:name="Colorful List Accent 2"/>
-    <w:lsdException w:unhideWhenUsed="0" w:uiPriority="73" w:semiHidden="0" w:name="Colorful Grid Accent 2"/>
+    <w:lsdException w:qFormat="1" w:unhideWhenUsed="0" w:uiPriority="66" w:semiHidden="0" w:name="Medium List 2 Accent 2"/>
+    <w:lsdException w:qFormat="1" w:unhideWhenUsed="0" w:uiPriority="67" w:semiHidden="0" w:name="Medium Grid 1 Accent 2"/>
+    <w:lsdException w:qFormat="1" w:unhideWhenUsed="0" w:uiPriority="68" w:semiHidden="0" w:name="Medium Grid 2 Accent 2"/>
+    <w:lsdException w:qFormat="1" w:unhideWhenUsed="0" w:uiPriority="69" w:semiHidden="0" w:name="Medium Grid 3 Accent 2"/>
+    <w:lsdException w:qFormat="1" w:unhideWhenUsed="0" w:uiPriority="70" w:semiHidden="0" w:name="Dark List Accent 2"/>
+    <w:lsdException w:qFormat="1" w:unhideWhenUsed="0" w:uiPriority="71" w:semiHidden="0" w:name="Colorful Shading Accent 2"/>
+    <w:lsdException w:qFormat="1" w:unhideWhenUsed="0" w:uiPriority="72" w:semiHidden="0" w:name="Colorful List Accent 2"/>
+    <w:lsdException w:qFormat="1" w:unhideWhenUsed="0" w:uiPriority="73" w:semiHidden="0" w:name="Colorful Grid Accent 2"/>
     <w:lsdException w:qFormat="1" w:unhideWhenUsed="0" w:uiPriority="60" w:semiHidden="0" w:name="Light Shading Accent 3"/>
     <w:lsdException w:qFormat="1" w:unhideWhenUsed="0" w:uiPriority="61" w:semiHidden="0" w:name="Light List Accent 3"/>
     <w:lsdException w:qFormat="1" w:unhideWhenUsed="0" w:uiPriority="62" w:semiHidden="0" w:name="Light Grid Accent 3"/>
     <w:lsdException w:qFormat="1" w:unhideWhenUsed="0" w:uiPriority="63" w:semiHidden="0" w:name="Medium Shading 1 Accent 3"/>
     <w:lsdException w:qFormat="1" w:unhideWhenUsed="0" w:uiPriority="64" w:semiHidden="0" w:name="Medium Shading 2 Accent 3"/>
-    <w:lsdException w:unhideWhenUsed="0" w:uiPriority="65" w:semiHidden="0" w:name="Medium List 1 Accent 3"/>
-    <w:lsdException w:unhideWhenUsed="0" w:uiPriority="66" w:semiHidden="0" w:name="Medium List 2 Accent 3"/>
-    <w:lsdException w:unhideWhenUsed="0" w:uiPriority="67" w:semiHidden="0" w:name="Medium Grid 1 Accent 3"/>
-    <w:lsdException w:unhideWhenUsed="0" w:uiPriority="68" w:semiHidden="0" w:name="Medium Grid 2 Accent 3"/>
-    <w:lsdException w:unhideWhenUsed="0" w:uiPriority="69" w:semiHidden="0" w:name="Medium Grid 3 Accent 3"/>
-    <w:lsdException w:unhideWhenUsed="0" w:uiPriority="70" w:semiHidden="0" w:name="Dark List Accent 3"/>
-    <w:lsdException w:unhideWhenUsed="0" w:uiPriority="71" w:semiHidden="0" w:name="Colorful Shading Accent 3"/>
-    <w:lsdException w:unhideWhenUsed="0" w:uiPriority="72" w:semiHidden="0" w:name="Colorful List Accent 3"/>
-    <w:lsdException w:unhideWhenUsed="0" w:uiPriority="73" w:semiHidden="0" w:name="Colorful Grid Accent 3"/>
-    <w:lsdException w:unhideWhenUsed="0" w:uiPriority="60" w:semiHidden="0" w:name="Light Shading Accent 4"/>
+    <w:lsdException w:qFormat="1" w:unhideWhenUsed="0" w:uiPriority="65" w:semiHidden="0" w:name="Medium List 1 Accent 3"/>
+    <w:lsdException w:qFormat="1" w:unhideWhenUsed="0" w:uiPriority="66" w:semiHidden="0" w:name="Medium List 2 Accent 3"/>
+    <w:lsdException w:qFormat="1" w:unhideWhenUsed="0" w:uiPriority="67" w:semiHidden="0" w:name="Medium Grid 1 Accent 3"/>
+    <w:lsdException w:qFormat="1" w:unhideWhenUsed="0" w:uiPriority="68" w:semiHidden="0" w:name="Medium Grid 2 Accent 3"/>
+    <w:lsdException w:qFormat="1" w:unhideWhenUsed="0" w:uiPriority="69" w:semiHidden="0" w:name="Medium Grid 3 Accent 3"/>
+    <w:lsdException w:qFormat="1" w:unhideWhenUsed="0" w:uiPriority="70" w:semiHidden="0" w:name="Dark List Accent 3"/>
+    <w:lsdException w:qFormat="1" w:unhideWhenUsed="0" w:uiPriority="71" w:semiHidden="0" w:name="Colorful Shading Accent 3"/>
+    <w:lsdException w:qFormat="1" w:unhideWhenUsed="0" w:uiPriority="72" w:semiHidden="0" w:name="Colorful List Accent 3"/>
+    <w:lsdException w:qFormat="1" w:unhideWhenUsed="0" w:uiPriority="73" w:semiHidden="0" w:name="Colorful Grid Accent 3"/>
+    <w:lsdException w:qFormat="1" w:unhideWhenUsed="0" w:uiPriority="60" w:semiHidden="0" w:name="Light Shading Accent 4"/>
     <w:lsdException w:qFormat="1" w:unhideWhenUsed="0" w:uiPriority="61" w:semiHidden="0" w:name="Light List Accent 4"/>
     <w:lsdException w:qFormat="1" w:unhideWhenUsed="0" w:uiPriority="62" w:semiHidden="0" w:name="Light Grid Accent 4"/>
     <w:lsdException w:qFormat="1" w:unhideWhenUsed="0" w:uiPriority="63" w:semiHidden="0" w:name="Medium Shading 1 Accent 4"/>
     <w:lsdException w:qFormat="1" w:unhideWhenUsed="0" w:uiPriority="64" w:semiHidden="0" w:name="Medium Shading 2 Accent 4"/>
-    <w:lsdException w:unhideWhenUsed="0" w:uiPriority="65" w:semiHidden="0" w:name="Medium List 1 Accent 4"/>
-    <w:lsdException w:unhideWhenUsed="0" w:uiPriority="66" w:semiHidden="0" w:name="Medium List 2 Accent 4"/>
-    <w:lsdException w:unhideWhenUsed="0" w:uiPriority="67" w:semiHidden="0" w:name="Medium Grid 1 Accent 4"/>
-    <w:lsdException w:unhideWhenUsed="0" w:uiPriority="68" w:semiHidden="0" w:name="Medium Grid 2 Accent 4"/>
-    <w:lsdException w:unhideWhenUsed="0" w:uiPriority="69" w:semiHidden="0" w:name="Medium Grid 3 Accent 4"/>
-    <w:lsdException w:unhideWhenUsed="0" w:uiPriority="70" w:semiHidden="0" w:name="Dark List Accent 4"/>
-    <w:lsdException w:unhideWhenUsed="0" w:uiPriority="71" w:semiHidden="0" w:name="Colorful Shading Accent 4"/>
-    <w:lsdException w:unhideWhenUsed="0" w:uiPriority="72" w:semiHidden="0" w:name="Colorful List Accent 4"/>
-    <w:lsdException w:unhideWhenUsed="0" w:uiPriority="73" w:semiHidden="0" w:name="Colorful Grid Accent 4"/>
+    <w:lsdException w:qFormat="1" w:unhideWhenUsed="0" w:uiPriority="65" w:semiHidden="0" w:name="Medium List 1 Accent 4"/>
+    <w:lsdException w:qFormat="1" w:unhideWhenUsed="0" w:uiPriority="66" w:semiHidden="0" w:name="Medium List 2 Accent 4"/>
+    <w:lsdException w:qFormat="1" w:unhideWhenUsed="0" w:uiPriority="67" w:semiHidden="0" w:name="Medium Grid 1 Accent 4"/>
+    <w:lsdException w:qFormat="1" w:unhideWhenUsed="0" w:uiPriority="68" w:semiHidden="0" w:name="Medium Grid 2 Accent 4"/>
+    <w:lsdException w:qFormat="1" w:unhideWhenUsed="0" w:uiPriority="69" w:semiHidden="0" w:name="Medium Grid 3 Accent 4"/>
+    <w:lsdException w:qFormat="1" w:unhideWhenUsed="0" w:uiPriority="70" w:semiHidden="0" w:name="Dark List Accent 4"/>
+    <w:lsdException w:qFormat="1" w:unhideWhenUsed="0" w:uiPriority="71" w:semiHidden="0" w:name="Colorful Shading Accent 4"/>
+    <w:lsdException w:qFormat="1" w:unhideWhenUsed="0" w:uiPriority="72" w:semiHidden="0" w:name="Colorful List Accent 4"/>
+    <w:lsdException w:qFormat="1" w:unhideWhenUsed="0" w:uiPriority="73" w:semiHidden="0" w:name="Colorful Grid Accent 4"/>
     <w:lsdException w:qFormat="1" w:unhideWhenUsed="0" w:uiPriority="60" w:semiHidden="0" w:name="Light Shading Accent 5"/>
     <w:lsdException w:qFormat="1" w:unhideWhenUsed="0" w:uiPriority="61" w:semiHidden="0" w:name="Light List Accent 5"/>
     <w:lsdException w:qFormat="1" w:unhideWhenUsed="0" w:uiPriority="62" w:semiHidden="0" w:name="Light Grid Accent 5"/>
-    <w:lsdException w:unhideWhenUsed="0" w:uiPriority="63" w:semiHidden="0" w:name="Medium Shading 1 Accent 5"/>
+    <w:lsdException w:qFormat="1" w:unhideWhenUsed="0" w:uiPriority="63" w:semiHidden="0" w:name="Medium Shading 1 Accent 5"/>
     <w:lsdException w:qFormat="1" w:unhideWhenUsed="0" w:uiPriority="64" w:semiHidden="0" w:name="Medium Shading 2 Accent 5"/>
-    <w:lsdException w:unhideWhenUsed="0" w:uiPriority="65" w:semiHidden="0" w:name="Medium List 1 Accent 5"/>
-    <w:lsdException w:unhideWhenUsed="0" w:uiPriority="66" w:semiHidden="0" w:name="Medium List 2 Accent 5"/>
-    <w:lsdException w:unhideWhenUsed="0" w:uiPriority="67" w:semiHidden="0" w:name="Medium Grid 1 Accent 5"/>
-    <w:lsdException w:unhideWhenUsed="0" w:uiPriority="68" w:semiHidden="0" w:name="Medium Grid 2 Accent 5"/>
-    <w:lsdException w:unhideWhenUsed="0" w:uiPriority="69" w:semiHidden="0" w:name="Medium Grid 3 Accent 5"/>
-    <w:lsdException w:unhideWhenUsed="0" w:uiPriority="70" w:semiHidden="0" w:name="Dark List Accent 5"/>
-    <w:lsdException w:unhideWhenUsed="0" w:uiPriority="71" w:semiHidden="0" w:name="Colorful Shading Accent 5"/>
-    <w:lsdException w:unhideWhenUsed="0" w:uiPriority="72" w:semiHidden="0" w:name="Colorful List Accent 5"/>
-    <w:lsdException w:unhideWhenUsed="0" w:uiPriority="73" w:semiHidden="0" w:name="Colorful Grid Accent 5"/>
+    <w:lsdException w:qFormat="1" w:unhideWhenUsed="0" w:uiPriority="65" w:semiHidden="0" w:name="Medium List 1 Accent 5"/>
+    <w:lsdException w:qFormat="1" w:unhideWhenUsed="0" w:uiPriority="66" w:semiHidden="0" w:name="Medium List 2 Accent 5"/>
+    <w:lsdException w:qFormat="1" w:unhideWhenUsed="0" w:uiPriority="67" w:semiHidden="0" w:name="Medium Grid 1 Accent 5"/>
+    <w:lsdException w:qFormat="1" w:unhideWhenUsed="0" w:uiPriority="68" w:semiHidden="0" w:name="Medium Grid 2 Accent 5"/>
+    <w:lsdException w:qFormat="1" w:unhideWhenUsed="0" w:uiPriority="69" w:semiHidden="0" w:name="Medium Grid 3 Accent 5"/>
+    <w:lsdException w:qFormat="1" w:unhideWhenUsed="0" w:uiPriority="70" w:semiHidden="0" w:name="Dark List Accent 5"/>
+    <w:lsdException w:qFormat="1" w:unhideWhenUsed="0" w:uiPriority="71" w:semiHidden="0" w:name="Colorful Shading Accent 5"/>
+    <w:lsdException w:qFormat="1" w:unhideWhenUsed="0" w:uiPriority="72" w:semiHidden="0" w:name="Colorful List Accent 5"/>
+    <w:lsdException w:qFormat="1" w:unhideWhenUsed="0" w:uiPriority="73" w:semiHidden="0" w:name="Colorful Grid Accent 5"/>
     <w:lsdException w:qFormat="1" w:unhideWhenUsed="0" w:uiPriority="60" w:semiHidden="0" w:name="Light Shading Accent 6"/>
     <w:lsdException w:qFormat="1" w:unhideWhenUsed="0" w:uiPriority="61" w:semiHidden="0" w:name="Light List Accent 6"/>
     <w:lsdException w:qFormat="1" w:unhideWhenUsed="0" w:uiPriority="62" w:semiHidden="0" w:name="Light Grid Accent 6"/>
     <w:lsdException w:qFormat="1" w:unhideWhenUsed="0" w:uiPriority="63" w:semiHidden="0" w:name="Medium Shading 1 Accent 6"/>
     <w:lsdException w:qFormat="1" w:unhideWhenUsed="0" w:uiPriority="64" w:semiHidden="0" w:name="Medium Shading 2 Accent 6"/>
-    <w:lsdException w:unhideWhenUsed="0" w:uiPriority="65" w:semiHidden="0" w:name="Medium List 1 Accent 6"/>
-    <w:lsdException w:unhideWhenUsed="0" w:uiPriority="66" w:semiHidden="0" w:name="Medium List 2 Accent 6"/>
-    <w:lsdException w:unhideWhenUsed="0" w:uiPriority="67" w:semiHidden="0" w:name="Medium Grid 1 Accent 6"/>
-    <w:lsdException w:unhideWhenUsed="0" w:uiPriority="68" w:semiHidden="0" w:name="Medium Grid 2 Accent 6"/>
-    <w:lsdException w:unhideWhenUsed="0" w:uiPriority="69" w:semiHidden="0" w:name="Medium Grid 3 Accent 6"/>
-    <w:lsdException w:unhideWhenUsed="0" w:uiPriority="70" w:semiHidden="0" w:name="Dark List Accent 6"/>
-    <w:lsdException w:unhideWhenUsed="0" w:uiPriority="71" w:semiHidden="0" w:name="Colorful Shading Accent 6"/>
-    <w:lsdException w:unhideWhenUsed="0" w:uiPriority="72" w:semiHidden="0" w:name="Colorful List Accent 6"/>
-    <w:lsdException w:unhideWhenUsed="0" w:uiPriority="73" w:semiHidden="0" w:name="Colorful Grid Accent 6"/>
+    <w:lsdException w:qFormat="1" w:unhideWhenUsed="0" w:uiPriority="65" w:semiHidden="0" w:name="Medium List 1 Accent 6"/>
+    <w:lsdException w:qFormat="1" w:unhideWhenUsed="0" w:uiPriority="66" w:semiHidden="0" w:name="Medium List 2 Accent 6"/>
+    <w:lsdException w:qFormat="1" w:unhideWhenUsed="0" w:uiPriority="67" w:semiHidden="0" w:name="Medium Grid 1 Accent 6"/>
+    <w:lsdException w:qFormat="1" w:unhideWhenUsed="0" w:uiPriority="68" w:semiHidden="0" w:name="Medium Grid 2 Accent 6"/>
+    <w:lsdException w:qFormat="1" w:unhideWhenUsed="0" w:uiPriority="69" w:semiHidden="0" w:name="Medium Grid 3 Accent 6"/>
+    <w:lsdException w:qFormat="1" w:unhideWhenUsed="0" w:uiPriority="70" w:semiHidden="0" w:name="Dark List Accent 6"/>
+    <w:lsdException w:qFormat="1" w:unhideWhenUsed="0" w:uiPriority="71" w:semiHidden="0" w:name="Colorful Shading Accent 6"/>
+    <w:lsdException w:qFormat="1" w:unhideWhenUsed="0" w:uiPriority="72" w:semiHidden="0" w:name="Colorful List Accent 6"/>
+    <w:lsdException w:qFormat="1" w:unhideWhenUsed="0" w:uiPriority="73" w:semiHidden="0" w:name="Colorful Grid Accent 6"/>
   </w:latentStyles>
   <w:style w:type="paragraph" w:default="1" w:styleId="1">
     <w:name w:val="Normal"/>
@@ -1121,12 +1170,14 @@
     <w:name w:val="Default Paragraph Font"/>
     <w:semiHidden/>
     <w:unhideWhenUsed/>
+    <w:qFormat/>
     <w:uiPriority w:val="1"/>
   </w:style>
   <w:style w:type="table" w:default="1" w:styleId="32">
     <w:name w:val="Normal Table"/>
     <w:semiHidden/>
     <w:unhideWhenUsed/>
+    <w:qFormat/>
     <w:uiPriority w:val="99"/>
     <w:tblPr>
       <w:tblCellMar>
@@ -1258,6 +1309,7 @@
     <w:name w:val="List Bullet 3"/>
     <w:basedOn w:val="1"/>
     <w:unhideWhenUsed/>
+    <w:qFormat/>
     <w:uiPriority w:val="99"/>
     <w:pPr>
       <w:numPr>
@@ -1407,6 +1459,7 @@
     <w:name w:val="List Continue 2"/>
     <w:basedOn w:val="1"/>
     <w:unhideWhenUsed/>
+    <w:qFormat/>
     <w:uiPriority w:val="99"/>
     <w:pPr>
       <w:spacing w:after="120"/>
@@ -1452,6 +1505,7 @@
   <w:style w:type="table" w:styleId="33">
     <w:name w:val="Table Grid"/>
     <w:basedOn w:val="32"/>
+    <w:qFormat/>
     <w:uiPriority w:val="59"/>
     <w:pPr>
       <w:spacing w:after="0" w:line="240" w:lineRule="auto"/>
@@ -1876,6 +1930,7 @@
   <w:style w:type="table" w:styleId="38">
     <w:name w:val="Light Shading Accent 4"/>
     <w:basedOn w:val="32"/>
+    <w:qFormat/>
     <w:uiPriority w:val="60"/>
     <w:pPr>
       <w:spacing w:after="0" w:line="240" w:lineRule="auto"/>
@@ -4262,6 +4317,7 @@
   <w:style w:type="table" w:styleId="60">
     <w:name w:val="Medium Shading 1 Accent 5"/>
     <w:basedOn w:val="32"/>
+    <w:qFormat/>
     <w:uiPriority w:val="63"/>
     <w:pPr>
       <w:spacing w:after="0" w:line="240" w:lineRule="auto"/>
@@ -4477,6 +4533,7 @@
   <w:style w:type="table" w:styleId="62">
     <w:name w:val="Medium Shading 2"/>
     <w:basedOn w:val="32"/>
+    <w:qFormat/>
     <w:uiPriority w:val="64"/>
     <w:pPr>
       <w:spacing w:after="0" w:line="240" w:lineRule="auto"/>
@@ -5638,6 +5695,7 @@
   <w:style w:type="table" w:styleId="69">
     <w:name w:val="Medium List 1"/>
     <w:basedOn w:val="32"/>
+    <w:qFormat/>
     <w:uiPriority w:val="65"/>
     <w:pPr>
       <w:spacing w:after="0" w:line="240" w:lineRule="auto"/>
@@ -5910,6 +5968,7 @@
   <w:style w:type="table" w:styleId="72">
     <w:name w:val="Medium List 1 Accent 3"/>
     <w:basedOn w:val="32"/>
+    <w:qFormat/>
     <w:uiPriority w:val="65"/>
     <w:pPr>
       <w:spacing w:after="0" w:line="240" w:lineRule="auto"/>
@@ -6000,6 +6059,7 @@
   <w:style w:type="table" w:styleId="73">
     <w:name w:val="Medium List 1 Accent 4"/>
     <w:basedOn w:val="32"/>
+    <w:qFormat/>
     <w:uiPriority w:val="65"/>
     <w:pPr>
       <w:spacing w:after="0" w:line="240" w:lineRule="auto"/>
@@ -6090,6 +6150,7 @@
   <w:style w:type="table" w:styleId="74">
     <w:name w:val="Medium List 1 Accent 5"/>
     <w:basedOn w:val="32"/>
+    <w:qFormat/>
     <w:uiPriority w:val="65"/>
     <w:pPr>
       <w:spacing w:after="0" w:line="240" w:lineRule="auto"/>
@@ -6180,6 +6241,7 @@
   <w:style w:type="table" w:styleId="75">
     <w:name w:val="Medium List 1 Accent 6"/>
     <w:basedOn w:val="32"/>
+    <w:qFormat/>
     <w:uiPriority w:val="65"/>
     <w:pPr>
       <w:spacing w:after="0" w:line="240" w:lineRule="auto"/>
@@ -6270,6 +6332,7 @@
   <w:style w:type="table" w:styleId="76">
     <w:name w:val="Medium List 2"/>
     <w:basedOn w:val="32"/>
+    <w:qFormat/>
     <w:uiPriority w:val="66"/>
     <w:pPr>
       <w:spacing w:after="0" w:line="240" w:lineRule="auto"/>
@@ -6399,6 +6462,7 @@
   <w:style w:type="table" w:styleId="77">
     <w:name w:val="Medium List 2 Accent 1"/>
     <w:basedOn w:val="32"/>
+    <w:qFormat/>
     <w:uiPriority w:val="66"/>
     <w:pPr>
       <w:spacing w:after="0" w:line="240" w:lineRule="auto"/>
@@ -6528,6 +6592,7 @@
   <w:style w:type="table" w:styleId="78">
     <w:name w:val="Medium List 2 Accent 2"/>
     <w:basedOn w:val="32"/>
+    <w:qFormat/>
     <w:uiPriority w:val="66"/>
     <w:pPr>
       <w:spacing w:after="0" w:line="240" w:lineRule="auto"/>
@@ -6657,6 +6722,7 @@
   <w:style w:type="table" w:styleId="79">
     <w:name w:val="Medium List 2 Accent 3"/>
     <w:basedOn w:val="32"/>
+    <w:qFormat/>
     <w:uiPriority w:val="66"/>
     <w:pPr>
       <w:spacing w:after="0" w:line="240" w:lineRule="auto"/>
@@ -6786,6 +6852,7 @@
   <w:style w:type="table" w:styleId="80">
     <w:name w:val="Medium List 2 Accent 4"/>
     <w:basedOn w:val="32"/>
+    <w:qFormat/>
     <w:uiPriority w:val="66"/>
     <w:pPr>
       <w:spacing w:after="0" w:line="240" w:lineRule="auto"/>
@@ -6915,6 +6982,7 @@
   <w:style w:type="table" w:styleId="81">
     <w:name w:val="Medium List 2 Accent 5"/>
     <w:basedOn w:val="32"/>
+    <w:qFormat/>
     <w:uiPriority w:val="66"/>
     <w:pPr>
       <w:spacing w:after="0" w:line="240" w:lineRule="auto"/>
@@ -7044,6 +7112,7 @@
   <w:style w:type="table" w:styleId="82">
     <w:name w:val="Medium List 2 Accent 6"/>
     <w:basedOn w:val="32"/>
+    <w:qFormat/>
     <w:uiPriority w:val="66"/>
     <w:pPr>
       <w:spacing w:after="0" w:line="240" w:lineRule="auto"/>
@@ -7173,6 +7242,7 @@
   <w:style w:type="table" w:styleId="83">
     <w:name w:val="Medium Grid 1"/>
     <w:basedOn w:val="32"/>
+    <w:qFormat/>
     <w:uiPriority w:val="67"/>
     <w:pPr>
       <w:spacing w:after="0" w:line="240" w:lineRule="auto"/>
@@ -7242,6 +7312,7 @@
   <w:style w:type="table" w:styleId="84">
     <w:name w:val="Medium Grid 1 Accent 1"/>
     <w:basedOn w:val="32"/>
+    <w:qFormat/>
     <w:uiPriority w:val="67"/>
     <w:pPr>
       <w:spacing w:after="0" w:line="240" w:lineRule="auto"/>
@@ -7311,6 +7382,7 @@
   <w:style w:type="table" w:styleId="85">
     <w:name w:val="Medium Grid 1 Accent 2"/>
     <w:basedOn w:val="32"/>
+    <w:qFormat/>
     <w:uiPriority w:val="67"/>
     <w:pPr>
       <w:spacing w:after="0" w:line="240" w:lineRule="auto"/>
@@ -7380,6 +7452,7 @@
   <w:style w:type="table" w:styleId="86">
     <w:name w:val="Medium Grid 1 Accent 3"/>
     <w:basedOn w:val="32"/>
+    <w:qFormat/>
     <w:uiPriority w:val="67"/>
     <w:pPr>
       <w:spacing w:after="0" w:line="240" w:lineRule="auto"/>
@@ -7449,6 +7522,7 @@
   <w:style w:type="table" w:styleId="87">
     <w:name w:val="Medium Grid 1 Accent 4"/>
     <w:basedOn w:val="32"/>
+    <w:qFormat/>
     <w:uiPriority w:val="67"/>
     <w:pPr>
       <w:spacing w:after="0" w:line="240" w:lineRule="auto"/>
@@ -7518,6 +7592,7 @@
   <w:style w:type="table" w:styleId="88">
     <w:name w:val="Medium Grid 1 Accent 5"/>
     <w:basedOn w:val="32"/>
+    <w:qFormat/>
     <w:uiPriority w:val="67"/>
     <w:pPr>
       <w:spacing w:after="0" w:line="240" w:lineRule="auto"/>
@@ -7587,6 +7662,7 @@
   <w:style w:type="table" w:styleId="89">
     <w:name w:val="Medium Grid 1 Accent 6"/>
     <w:basedOn w:val="32"/>
+    <w:qFormat/>
     <w:uiPriority w:val="67"/>
     <w:pPr>
       <w:spacing w:after="0" w:line="240" w:lineRule="auto"/>
@@ -7656,6 +7732,7 @@
   <w:style w:type="table" w:styleId="90">
     <w:name w:val="Medium Grid 2"/>
     <w:basedOn w:val="32"/>
+    <w:qFormat/>
     <w:uiPriority w:val="68"/>
     <w:pPr>
       <w:spacing w:after="0" w:line="240" w:lineRule="auto"/>
@@ -7802,6 +7879,7 @@
   <w:style w:type="table" w:styleId="91">
     <w:name w:val="Medium Grid 2 Accent 1"/>
     <w:basedOn w:val="32"/>
+    <w:qFormat/>
     <w:uiPriority w:val="68"/>
     <w:pPr>
       <w:spacing w:after="0" w:line="240" w:lineRule="auto"/>
@@ -7948,6 +8026,7 @@
   <w:style w:type="table" w:styleId="92">
     <w:name w:val="Medium Grid 2 Accent 2"/>
     <w:basedOn w:val="32"/>
+    <w:qFormat/>
     <w:uiPriority w:val="68"/>
     <w:pPr>
       <w:spacing w:after="0" w:line="240" w:lineRule="auto"/>
@@ -8094,6 +8173,7 @@
   <w:style w:type="table" w:styleId="93">
     <w:name w:val="Medium Grid 2 Accent 3"/>
     <w:basedOn w:val="32"/>
+    <w:qFormat/>
     <w:uiPriority w:val="68"/>
     <w:pPr>
       <w:spacing w:after="0" w:line="240" w:lineRule="auto"/>
@@ -8240,6 +8320,7 @@
   <w:style w:type="table" w:styleId="94">
     <w:name w:val="Medium Grid 2 Accent 4"/>
     <w:basedOn w:val="32"/>
+    <w:qFormat/>
     <w:uiPriority w:val="68"/>
     <w:pPr>
       <w:spacing w:after="0" w:line="240" w:lineRule="auto"/>
@@ -8386,6 +8467,7 @@
   <w:style w:type="table" w:styleId="95">
     <w:name w:val="Medium Grid 2 Accent 5"/>
     <w:basedOn w:val="32"/>
+    <w:qFormat/>
     <w:uiPriority w:val="68"/>
     <w:pPr>
       <w:spacing w:after="0" w:line="240" w:lineRule="auto"/>
@@ -8532,6 +8614,7 @@
   <w:style w:type="table" w:styleId="96">
     <w:name w:val="Medium Grid 2 Accent 6"/>
     <w:basedOn w:val="32"/>
+    <w:qFormat/>
     <w:uiPriority w:val="68"/>
     <w:pPr>
       <w:spacing w:after="0" w:line="240" w:lineRule="auto"/>
@@ -8678,6 +8761,7 @@
   <w:style w:type="table" w:styleId="97">
     <w:name w:val="Medium Grid 3"/>
     <w:basedOn w:val="32"/>
+    <w:qFormat/>
     <w:uiPriority w:val="69"/>
     <w:pPr>
       <w:spacing w:after="0" w:line="240" w:lineRule="auto"/>
@@ -8835,6 +8919,7 @@
   <w:style w:type="table" w:styleId="98">
     <w:name w:val="Medium Grid 3 Accent 1"/>
     <w:basedOn w:val="32"/>
+    <w:qFormat/>
     <w:uiPriority w:val="69"/>
     <w:pPr>
       <w:spacing w:after="0" w:line="240" w:lineRule="auto"/>
@@ -8992,6 +9077,7 @@
   <w:style w:type="table" w:styleId="99">
     <w:name w:val="Medium Grid 3 Accent 2"/>
     <w:basedOn w:val="32"/>
+    <w:qFormat/>
     <w:uiPriority w:val="69"/>
     <w:pPr>
       <w:spacing w:after="0" w:line="240" w:lineRule="auto"/>
@@ -9149,6 +9235,7 @@
   <w:style w:type="table" w:styleId="100">
     <w:name w:val="Medium Grid 3 Accent 3"/>
     <w:basedOn w:val="32"/>
+    <w:qFormat/>
     <w:uiPriority w:val="69"/>
     <w:pPr>
       <w:spacing w:after="0" w:line="240" w:lineRule="auto"/>
@@ -9306,6 +9393,7 @@
   <w:style w:type="table" w:styleId="101">
     <w:name w:val="Medium Grid 3 Accent 4"/>
     <w:basedOn w:val="32"/>
+    <w:qFormat/>
     <w:uiPriority w:val="69"/>
     <w:pPr>
       <w:spacing w:after="0" w:line="240" w:lineRule="auto"/>
@@ -9463,6 +9551,7 @@
   <w:style w:type="table" w:styleId="102">
     <w:name w:val="Medium Grid 3 Accent 5"/>
     <w:basedOn w:val="32"/>
+    <w:qFormat/>
     <w:uiPriority w:val="69"/>
     <w:pPr>
       <w:spacing w:after="0" w:line="240" w:lineRule="auto"/>
@@ -9620,6 +9709,7 @@
   <w:style w:type="table" w:styleId="103">
     <w:name w:val="Medium Grid 3 Accent 6"/>
     <w:basedOn w:val="32"/>
+    <w:qFormat/>
     <w:uiPriority w:val="69"/>
     <w:pPr>
       <w:spacing w:after="0" w:line="240" w:lineRule="auto"/>
@@ -9777,6 +9867,7 @@
   <w:style w:type="table" w:styleId="104">
     <w:name w:val="Dark List"/>
     <w:basedOn w:val="32"/>
+    <w:qFormat/>
     <w:uiPriority w:val="70"/>
     <w:pPr>
       <w:spacing w:after="0" w:line="240" w:lineRule="auto"/>
@@ -9892,6 +9983,7 @@
   <w:style w:type="table" w:styleId="105">
     <w:name w:val="Dark List Accent 1"/>
     <w:basedOn w:val="32"/>
+    <w:qFormat/>
     <w:uiPriority w:val="70"/>
     <w:pPr>
       <w:spacing w:after="0" w:line="240" w:lineRule="auto"/>
@@ -10007,6 +10099,7 @@
   <w:style w:type="table" w:styleId="106">
     <w:name w:val="Dark List Accent 2"/>
     <w:basedOn w:val="32"/>
+    <w:qFormat/>
     <w:uiPriority w:val="70"/>
     <w:pPr>
       <w:spacing w:after="0" w:line="240" w:lineRule="auto"/>
@@ -10122,6 +10215,7 @@
   <w:style w:type="table" w:styleId="107">
     <w:name w:val="Dark List Accent 3"/>
     <w:basedOn w:val="32"/>
+    <w:qFormat/>
     <w:uiPriority w:val="70"/>
     <w:pPr>
       <w:spacing w:after="0" w:line="240" w:lineRule="auto"/>
@@ -10237,6 +10331,7 @@
   <w:style w:type="table" w:styleId="108">
     <w:name w:val="Dark List Accent 4"/>
     <w:basedOn w:val="32"/>
+    <w:qFormat/>
     <w:uiPriority w:val="70"/>
     <w:pPr>
       <w:spacing w:after="0" w:line="240" w:lineRule="auto"/>
@@ -10352,6 +10447,7 @@
   <w:style w:type="table" w:styleId="109">
     <w:name w:val="Dark List Accent 5"/>
     <w:basedOn w:val="32"/>
+    <w:qFormat/>
     <w:uiPriority w:val="70"/>
     <w:pPr>
       <w:spacing w:after="0" w:line="240" w:lineRule="auto"/>
@@ -10467,6 +10563,7 @@
   <w:style w:type="table" w:styleId="110">
     <w:name w:val="Dark List Accent 6"/>
     <w:basedOn w:val="32"/>
+    <w:qFormat/>
     <w:uiPriority w:val="70"/>
     <w:pPr>
       <w:spacing w:after="0" w:line="240" w:lineRule="auto"/>
@@ -10582,6 +10679,7 @@
   <w:style w:type="table" w:styleId="111">
     <w:name w:val="Colorful Shading"/>
     <w:basedOn w:val="32"/>
+    <w:qFormat/>
     <w:uiPriority w:val="71"/>
     <w:pPr>
       <w:spacing w:after="0" w:line="240" w:lineRule="auto"/>
@@ -10730,6 +10828,7 @@
   <w:style w:type="table" w:styleId="112">
     <w:name w:val="Colorful Shading Accent 1"/>
     <w:basedOn w:val="32"/>
+    <w:qFormat/>
     <w:uiPriority w:val="71"/>
     <w:pPr>
       <w:spacing w:after="0" w:line="240" w:lineRule="auto"/>
@@ -10878,6 +10977,7 @@
   <w:style w:type="table" w:styleId="113">
     <w:name w:val="Colorful Shading Accent 2"/>
     <w:basedOn w:val="32"/>
+    <w:qFormat/>
     <w:uiPriority w:val="71"/>
     <w:pPr>
       <w:spacing w:after="0" w:line="240" w:lineRule="auto"/>
@@ -11026,6 +11126,7 @@
   <w:style w:type="table" w:styleId="114">
     <w:name w:val="Colorful Shading Accent 3"/>
     <w:basedOn w:val="32"/>
+    <w:qFormat/>
     <w:uiPriority w:val="71"/>
     <w:pPr>
       <w:spacing w:after="0" w:line="240" w:lineRule="auto"/>
@@ -11154,6 +11255,7 @@
   <w:style w:type="table" w:styleId="115">
     <w:name w:val="Colorful Shading Accent 4"/>
     <w:basedOn w:val="32"/>
+    <w:qFormat/>
     <w:uiPriority w:val="71"/>
     <w:pPr>
       <w:spacing w:after="0" w:line="240" w:lineRule="auto"/>
@@ -11302,6 +11404,7 @@
   <w:style w:type="table" w:styleId="116">
     <w:name w:val="Colorful Shading Accent 5"/>
     <w:basedOn w:val="32"/>
+    <w:qFormat/>
     <w:uiPriority w:val="71"/>
     <w:pPr>
       <w:spacing w:after="0" w:line="240" w:lineRule="auto"/>
@@ -11450,6 +11553,7 @@
   <w:style w:type="table" w:styleId="117">
     <w:name w:val="Colorful Shading Accent 6"/>
     <w:basedOn w:val="32"/>
+    <w:qFormat/>
     <w:uiPriority w:val="71"/>
     <w:pPr>
       <w:spacing w:after="0" w:line="240" w:lineRule="auto"/>
@@ -11598,6 +11702,7 @@
   <w:style w:type="table" w:styleId="118">
     <w:name w:val="Colorful List"/>
     <w:basedOn w:val="32"/>
+    <w:qFormat/>
     <w:uiPriority w:val="72"/>
     <w:pPr>
       <w:spacing w:after="0" w:line="240" w:lineRule="auto"/>
@@ -11690,6 +11795,7 @@
   <w:style w:type="table" w:styleId="119">
     <w:name w:val="Colorful List Accent 1"/>
     <w:basedOn w:val="32"/>
+    <w:qFormat/>
     <w:uiPriority w:val="72"/>
     <w:pPr>
       <w:spacing w:after="0" w:line="240" w:lineRule="auto"/>
@@ -11782,6 +11888,7 @@
   <w:style w:type="table" w:styleId="120">
     <w:name w:val="Colorful List Accent 2"/>
     <w:basedOn w:val="32"/>
+    <w:qFormat/>
     <w:uiPriority w:val="72"/>
     <w:pPr>
       <w:spacing w:after="0" w:line="240" w:lineRule="auto"/>
@@ -11874,6 +11981,7 @@
   <w:style w:type="table" w:styleId="121">
     <w:name w:val="Colorful List Accent 3"/>
     <w:basedOn w:val="32"/>
+    <w:qFormat/>
     <w:uiPriority w:val="72"/>
     <w:pPr>
       <w:spacing w:after="0" w:line="240" w:lineRule="auto"/>
@@ -11966,6 +12074,7 @@
   <w:style w:type="table" w:styleId="122">
     <w:name w:val="Colorful List Accent 4"/>
     <w:basedOn w:val="32"/>
+    <w:qFormat/>
     <w:uiPriority w:val="72"/>
     <w:pPr>
       <w:spacing w:after="0" w:line="240" w:lineRule="auto"/>
@@ -12058,6 +12167,7 @@
   <w:style w:type="table" w:styleId="123">
     <w:name w:val="Colorful List Accent 5"/>
     <w:basedOn w:val="32"/>
+    <w:qFormat/>
     <w:uiPriority w:val="72"/>
     <w:pPr>
       <w:spacing w:after="0" w:line="240" w:lineRule="auto"/>
@@ -12150,6 +12260,7 @@
   <w:style w:type="table" w:styleId="124">
     <w:name w:val="Colorful List Accent 6"/>
     <w:basedOn w:val="32"/>
+    <w:qFormat/>
     <w:uiPriority w:val="72"/>
     <w:pPr>
       <w:spacing w:after="0" w:line="240" w:lineRule="auto"/>
@@ -12242,6 +12353,7 @@
   <w:style w:type="table" w:styleId="125">
     <w:name w:val="Colorful Grid"/>
     <w:basedOn w:val="32"/>
+    <w:qFormat/>
     <w:uiPriority w:val="73"/>
     <w:pPr>
       <w:spacing w:after="0" w:line="240" w:lineRule="auto"/>
@@ -12338,6 +12450,7 @@
   <w:style w:type="table" w:styleId="126">
     <w:name w:val="Colorful Grid Accent 1"/>
     <w:basedOn w:val="32"/>
+    <w:qFormat/>
     <w:uiPriority w:val="73"/>
     <w:pPr>
       <w:spacing w:after="0" w:line="240" w:lineRule="auto"/>
@@ -12434,6 +12547,7 @@
   <w:style w:type="table" w:styleId="127">
     <w:name w:val="Colorful Grid Accent 2"/>
     <w:basedOn w:val="32"/>
+    <w:qFormat/>
     <w:uiPriority w:val="73"/>
     <w:pPr>
       <w:spacing w:after="0" w:line="240" w:lineRule="auto"/>
@@ -12530,6 +12644,7 @@
   <w:style w:type="table" w:styleId="128">
     <w:name w:val="Colorful Grid Accent 3"/>
     <w:basedOn w:val="32"/>
+    <w:qFormat/>
     <w:uiPriority w:val="73"/>
     <w:pPr>
       <w:spacing w:after="0" w:line="240" w:lineRule="auto"/>
@@ -12626,6 +12741,7 @@
   <w:style w:type="table" w:styleId="129">
     <w:name w:val="Colorful Grid Accent 4"/>
     <w:basedOn w:val="32"/>
+    <w:qFormat/>
     <w:uiPriority w:val="73"/>
     <w:pPr>
       <w:spacing w:after="0" w:line="240" w:lineRule="auto"/>
@@ -12722,6 +12838,7 @@
   <w:style w:type="table" w:styleId="130">
     <w:name w:val="Colorful Grid Accent 5"/>
     <w:basedOn w:val="32"/>
+    <w:qFormat/>
     <w:uiPriority w:val="73"/>
     <w:pPr>
       <w:spacing w:after="0" w:line="240" w:lineRule="auto"/>
@@ -12818,6 +12935,7 @@
   <w:style w:type="table" w:styleId="131">
     <w:name w:val="Colorful Grid Accent 6"/>
     <w:basedOn w:val="32"/>
+    <w:qFormat/>
     <w:uiPriority w:val="73"/>
     <w:pPr>
       <w:spacing w:after="0" w:line="240" w:lineRule="auto"/>
@@ -12935,12 +13053,14 @@
     <w:name w:val="Header Char"/>
     <w:basedOn w:val="132"/>
     <w:link w:val="25"/>
+    <w:qFormat/>
     <w:uiPriority w:val="99"/>
   </w:style>
   <w:style w:type="character" w:customStyle="1" w:styleId="136">
     <w:name w:val="Footer Char"/>
     <w:basedOn w:val="132"/>
     <w:link w:val="24"/>
+    <w:qFormat/>
     <w:uiPriority w:val="99"/>
   </w:style>
   <w:style w:type="paragraph" w:styleId="137">
@@ -13255,6 +13375,7 @@
     <w:name w:val="Intense Quote Char"/>
     <w:basedOn w:val="132"/>
     <w:link w:val="156"/>
+    <w:qFormat/>
     <w:uiPriority w:val="30"/>
     <w:rPr>
       <w:b/>

</xml_diff>